<commit_message>
Updated docs, added GetX and tweaked other widget docs
</commit_message>
<xml_diff>
--- a/flutter more documents/f40_reduce_app_size_flutter.docx
+++ b/flutter more documents/f40_reduce_app_size_flutter.docx
@@ -2922,6 +2922,17 @@
           <w:szCs w:val="36"/>
         </w:rPr>
       </w:pPr>
+    </w:p>
+    <w:p>
+      <w:pPr>
+        <w:jc w:val="both"/>
+        <w:rPr>
+          <w:b/>
+          <w:bCs/>
+          <w:sz w:val="36"/>
+          <w:szCs w:val="36"/>
+        </w:rPr>
+      </w:pPr>
       <w:r>
         <w:rPr>
           <w:b/>
@@ -2931,6 +2942,44 @@
         </w:rPr>
         <w:t xml:space="preserve">NOTE: </w:t>
       </w:r>
+      <w:r>
+        <w:rPr>
+          <w:sz w:val="36"/>
+          <w:szCs w:val="36"/>
+        </w:rPr>
+        <w:t xml:space="preserve">Also enable is Minify and shrinking resources in </w:t>
+      </w:r>
+      <w:r>
+        <w:rPr>
+          <w:b/>
+          <w:bCs/>
+          <w:sz w:val="36"/>
+          <w:szCs w:val="36"/>
+        </w:rPr>
+        <w:t>app/</w:t>
+      </w:r>
+      <w:proofErr w:type="spellStart"/>
+      <w:r>
+        <w:rPr>
+          <w:b/>
+          <w:bCs/>
+          <w:sz w:val="36"/>
+          <w:szCs w:val="36"/>
+        </w:rPr>
+        <w:t>build.gradle.kts</w:t>
+      </w:r>
+      <w:proofErr w:type="spellEnd"/>
+    </w:p>
+    <w:p>
+      <w:pPr>
+        <w:jc w:val="both"/>
+        <w:rPr>
+          <w:b/>
+          <w:bCs/>
+          <w:sz w:val="36"/>
+          <w:szCs w:val="36"/>
+        </w:rPr>
+      </w:pPr>
     </w:p>
     <w:p>
       <w:pPr>

</xml_diff>